<commit_message>
updates to catch, minor bug fixes, creep; retros; projections
</commit_message>
<xml_diff>
--- a/assessment/risk_tables/FinMod_h1_msy_output.docx
+++ b/assessment/risk_tables/FinMod_h1_msy_output.docx
@@ -77,6 +77,9 @@
         <w:tblStyle w:val="Table"/>
         <w:tblW w:type="pct" w:w="5000"/>
         <w:tblLook w:firstRow="1" w:lastRow="0" w:firstColumn="0" w:lastColumn="0" w:noHBand="0" w:noVBand="0" w:val="0020"/>
+        <w:jc w:val="start"/>
+        <w:tblInd w:w="720" w:type="dxa"/>
+        <w:tblLayout w:type="fixed"/>
       </w:tblPr>
       <w:tblGrid>
         <w:gridCol w:w="1137"/>
@@ -97,10 +100,6 @@
           <w:tcPr/>
           <w:p>
             <w:pPr>
-              <w:numPr>
-                <w:ilvl w:val="0"/>
-                <w:numId w:val="1000"/>
-              </w:numPr>
               <w:pStyle w:val="Compact"/>
               <w:jc w:val="center"/>
             </w:pPr>
@@ -119,7 +118,7 @@
                 </m:e>
                 <m:sub>
                   <m:r>
-                    <m:t>2022</m:t>
+                    <m:t>2023</m:t>
                   </m:r>
                 </m:sub>
               </m:sSub>
@@ -130,10 +129,6 @@
           <w:tcPr/>
           <w:p>
             <w:pPr>
-              <w:numPr>
-                <w:ilvl w:val="0"/>
-                <w:numId w:val="1000"/>
-              </w:numPr>
               <w:pStyle w:val="Compact"/>
               <w:jc w:val="center"/>
             </w:pPr>
@@ -146,7 +141,7 @@
                 </m:e>
                 <m:sub>
                   <m:r>
-                    <m:t>2024</m:t>
+                    <m:t>2025</m:t>
                   </m:r>
                 </m:sub>
               </m:sSub>
@@ -157,10 +152,6 @@
           <w:tcPr/>
           <w:p>
             <w:pPr>
-              <w:numPr>
-                <w:ilvl w:val="0"/>
-                <w:numId w:val="1000"/>
-              </w:numPr>
               <w:pStyle w:val="Compact"/>
               <w:jc w:val="center"/>
             </w:pPr>
@@ -176,7 +167,7 @@
                 </m:e>
                 <m:sub>
                   <m:r>
-                    <m:t>2024</m:t>
+                    <m:t>2025</m:t>
                   </m:r>
                 </m:sub>
               </m:sSub>
@@ -219,10 +210,6 @@
           <w:tcPr/>
           <w:p>
             <w:pPr>
-              <w:numPr>
-                <w:ilvl w:val="0"/>
-                <w:numId w:val="1000"/>
-              </w:numPr>
               <w:pStyle w:val="Compact"/>
               <w:jc w:val="center"/>
             </w:pPr>
@@ -235,7 +222,7 @@
                 </m:e>
                 <m:sub>
                   <m:r>
-                    <m:t>2028</m:t>
+                    <m:t>2029</m:t>
                   </m:r>
                 </m:sub>
               </m:sSub>
@@ -246,10 +233,6 @@
           <w:tcPr/>
           <w:p>
             <w:pPr>
-              <w:numPr>
-                <w:ilvl w:val="0"/>
-                <w:numId w:val="1000"/>
-              </w:numPr>
               <w:pStyle w:val="Compact"/>
               <w:jc w:val="center"/>
             </w:pPr>
@@ -265,7 +248,7 @@
                 </m:e>
                 <m:sub>
                   <m:r>
-                    <m:t>2028</m:t>
+                    <m:t>2029</m:t>
                   </m:r>
                 </m:sub>
               </m:sSub>
@@ -308,10 +291,6 @@
           <w:tcPr/>
           <w:p>
             <w:pPr>
-              <w:numPr>
-                <w:ilvl w:val="0"/>
-                <w:numId w:val="1000"/>
-              </w:numPr>
               <w:pStyle w:val="Compact"/>
               <w:jc w:val="center"/>
             </w:pPr>
@@ -324,7 +303,7 @@
                 </m:e>
                 <m:sub>
                   <m:r>
-                    <m:t>2032</m:t>
+                    <m:t>2033</m:t>
                   </m:r>
                 </m:sub>
               </m:sSub>
@@ -335,10 +314,6 @@
           <w:tcPr/>
           <w:p>
             <w:pPr>
-              <w:numPr>
-                <w:ilvl w:val="0"/>
-                <w:numId w:val="1000"/>
-              </w:numPr>
               <w:pStyle w:val="Compact"/>
               <w:jc w:val="center"/>
             </w:pPr>
@@ -354,7 +329,7 @@
                 </m:e>
                 <m:sub>
                   <m:r>
-                    <m:t>2032</m:t>
+                    <m:t>2033</m:t>
                   </m:r>
                 </m:sub>
               </m:sSub>
@@ -397,31 +372,23 @@
           <w:tcPr/>
           <w:p>
             <w:pPr>
-              <w:numPr>
-                <w:ilvl w:val="0"/>
-                <w:numId w:val="1000"/>
-              </w:numPr>
-              <w:pStyle w:val="Compact"/>
-              <w:jc w:val="center"/>
-            </w:pPr>
-            <w:r>
-              <w:t xml:space="preserve">Catch 2023 (kt)</w:t>
-            </w:r>
-          </w:p>
-        </w:tc>
-        <w:tc>
-          <w:tcPr/>
-          <w:p>
-            <w:pPr>
-              <w:numPr>
-                <w:ilvl w:val="0"/>
-                <w:numId w:val="1000"/>
-              </w:numPr>
               <w:pStyle w:val="Compact"/>
               <w:jc w:val="center"/>
             </w:pPr>
             <w:r>
               <w:t xml:space="preserve">Catch 2024 (kt)</w:t>
+            </w:r>
+          </w:p>
+        </w:tc>
+        <w:tc>
+          <w:tcPr/>
+          <w:p>
+            <w:pPr>
+              <w:pStyle w:val="Compact"/>
+              <w:jc w:val="center"/>
+            </w:pPr>
+            <w:r>
+              <w:t xml:space="preserve">Catch 2025 (kt)</w:t>
             </w:r>
           </w:p>
         </w:tc>
@@ -431,10 +398,6 @@
           <w:tcPr/>
           <w:p>
             <w:pPr>
-              <w:numPr>
-                <w:ilvl w:val="0"/>
-                <w:numId w:val="1000"/>
-              </w:numPr>
               <w:pStyle w:val="Compact"/>
               <w:jc w:val="center"/>
             </w:pPr>
@@ -447,26 +410,18 @@
           <w:tcPr/>
           <w:p>
             <w:pPr>
-              <w:numPr>
-                <w:ilvl w:val="0"/>
-                <w:numId w:val="1000"/>
-              </w:numPr>
-              <w:pStyle w:val="Compact"/>
-              <w:jc w:val="center"/>
-            </w:pPr>
-            <w:r>
-              <w:t xml:space="preserve">16784</w:t>
-            </w:r>
-          </w:p>
-        </w:tc>
-        <w:tc>
-          <w:tcPr/>
-          <w:p>
-            <w:pPr>
-              <w:numPr>
-                <w:ilvl w:val="0"/>
-                <w:numId w:val="1000"/>
-              </w:numPr>
+              <w:pStyle w:val="Compact"/>
+              <w:jc w:val="center"/>
+            </w:pPr>
+            <w:r>
+              <w:t xml:space="preserve">18415</w:t>
+            </w:r>
+          </w:p>
+        </w:tc>
+        <w:tc>
+          <w:tcPr/>
+          <w:p>
+            <w:pPr>
               <w:pStyle w:val="Compact"/>
               <w:jc w:val="center"/>
             </w:pPr>
@@ -479,26 +434,18 @@
           <w:tcPr/>
           <w:p>
             <w:pPr>
-              <w:numPr>
-                <w:ilvl w:val="0"/>
-                <w:numId w:val="1000"/>
-              </w:numPr>
-              <w:pStyle w:val="Compact"/>
-              <w:jc w:val="center"/>
-            </w:pPr>
-            <w:r>
-              <w:t xml:space="preserve">19946</w:t>
-            </w:r>
-          </w:p>
-        </w:tc>
-        <w:tc>
-          <w:tcPr/>
-          <w:p>
-            <w:pPr>
-              <w:numPr>
-                <w:ilvl w:val="0"/>
-                <w:numId w:val="1000"/>
-              </w:numPr>
+              <w:pStyle w:val="Compact"/>
+              <w:jc w:val="center"/>
+            </w:pPr>
+            <w:r>
+              <w:t xml:space="preserve">20915</w:t>
+            </w:r>
+          </w:p>
+        </w:tc>
+        <w:tc>
+          <w:tcPr/>
+          <w:p>
+            <w:pPr>
               <w:pStyle w:val="Compact"/>
               <w:jc w:val="center"/>
             </w:pPr>
@@ -511,26 +458,18 @@
           <w:tcPr/>
           <w:p>
             <w:pPr>
-              <w:numPr>
-                <w:ilvl w:val="0"/>
-                <w:numId w:val="1000"/>
-              </w:numPr>
-              <w:pStyle w:val="Compact"/>
-              <w:jc w:val="center"/>
-            </w:pPr>
-            <w:r>
-              <w:t xml:space="preserve">21436</w:t>
-            </w:r>
-          </w:p>
-        </w:tc>
-        <w:tc>
-          <w:tcPr/>
-          <w:p>
-            <w:pPr>
-              <w:numPr>
-                <w:ilvl w:val="0"/>
-                <w:numId w:val="1000"/>
-              </w:numPr>
+              <w:pStyle w:val="Compact"/>
+              <w:jc w:val="center"/>
+            </w:pPr>
+            <w:r>
+              <w:t xml:space="preserve">22109</w:t>
+            </w:r>
+          </w:p>
+        </w:tc>
+        <w:tc>
+          <w:tcPr/>
+          <w:p>
+            <w:pPr>
               <w:pStyle w:val="Compact"/>
               <w:jc w:val="center"/>
             </w:pPr>
@@ -543,10 +482,6 @@
           <w:tcPr/>
           <w:p>
             <w:pPr>
-              <w:numPr>
-                <w:ilvl w:val="0"/>
-                <w:numId w:val="1000"/>
-              </w:numPr>
               <w:pStyle w:val="Compact"/>
               <w:jc w:val="center"/>
             </w:pPr>
@@ -559,10 +494,6 @@
           <w:tcPr/>
           <w:p>
             <w:pPr>
-              <w:numPr>
-                <w:ilvl w:val="0"/>
-                <w:numId w:val="1000"/>
-              </w:numPr>
               <w:pStyle w:val="Compact"/>
               <w:jc w:val="center"/>
             </w:pPr>
@@ -577,10 +508,6 @@
           <w:tcPr/>
           <w:p>
             <w:pPr>
-              <w:numPr>
-                <w:ilvl w:val="0"/>
-                <w:numId w:val="1000"/>
-              </w:numPr>
               <w:pStyle w:val="Compact"/>
               <w:jc w:val="center"/>
             </w:pPr>
@@ -593,127 +520,95 @@
           <w:tcPr/>
           <w:p>
             <w:pPr>
-              <w:numPr>
-                <w:ilvl w:val="0"/>
-                <w:numId w:val="1000"/>
-              </w:numPr>
-              <w:pStyle w:val="Compact"/>
-              <w:jc w:val="center"/>
-            </w:pPr>
-            <w:r>
-              <w:t xml:space="preserve">10968</w:t>
-            </w:r>
-          </w:p>
-        </w:tc>
-        <w:tc>
-          <w:tcPr/>
-          <w:p>
-            <w:pPr>
-              <w:numPr>
-                <w:ilvl w:val="0"/>
-                <w:numId w:val="1000"/>
-              </w:numPr>
-              <w:pStyle w:val="Compact"/>
-              <w:jc w:val="center"/>
-            </w:pPr>
-            <w:r>
-              <w:t xml:space="preserve">96</w:t>
-            </w:r>
-          </w:p>
-        </w:tc>
-        <w:tc>
-          <w:tcPr/>
-          <w:p>
-            <w:pPr>
-              <w:numPr>
-                <w:ilvl w:val="0"/>
-                <w:numId w:val="1000"/>
-              </w:numPr>
-              <w:pStyle w:val="Compact"/>
-              <w:jc w:val="center"/>
-            </w:pPr>
-            <w:r>
-              <w:t xml:space="preserve">8304</w:t>
-            </w:r>
-          </w:p>
-        </w:tc>
-        <w:tc>
-          <w:tcPr/>
-          <w:p>
-            <w:pPr>
-              <w:numPr>
-                <w:ilvl w:val="0"/>
-                <w:numId w:val="1000"/>
-              </w:numPr>
-              <w:pStyle w:val="Compact"/>
-              <w:jc w:val="center"/>
-            </w:pPr>
-            <w:r>
-              <w:t xml:space="preserve">58</w:t>
-            </w:r>
-          </w:p>
-        </w:tc>
-        <w:tc>
-          <w:tcPr/>
-          <w:p>
-            <w:pPr>
-              <w:numPr>
-                <w:ilvl w:val="0"/>
-                <w:numId w:val="1000"/>
-              </w:numPr>
-              <w:pStyle w:val="Compact"/>
-              <w:jc w:val="center"/>
-            </w:pPr>
-            <w:r>
-              <w:t xml:space="preserve">7771</w:t>
-            </w:r>
-          </w:p>
-        </w:tc>
-        <w:tc>
-          <w:tcPr/>
-          <w:p>
-            <w:pPr>
-              <w:numPr>
-                <w:ilvl w:val="0"/>
-                <w:numId w:val="1000"/>
-              </w:numPr>
-              <w:pStyle w:val="Compact"/>
-              <w:jc w:val="center"/>
-            </w:pPr>
-            <w:r>
-              <w:t xml:space="preserve">49</w:t>
-            </w:r>
-          </w:p>
-        </w:tc>
-        <w:tc>
-          <w:tcPr/>
-          <w:p>
-            <w:pPr>
-              <w:numPr>
-                <w:ilvl w:val="0"/>
-                <w:numId w:val="1000"/>
-              </w:numPr>
-              <w:pStyle w:val="Compact"/>
-              <w:jc w:val="center"/>
-            </w:pPr>
-            <w:r>
-              <w:t xml:space="preserve">3074</w:t>
-            </w:r>
-          </w:p>
-        </w:tc>
-        <w:tc>
-          <w:tcPr/>
-          <w:p>
-            <w:pPr>
-              <w:numPr>
-                <w:ilvl w:val="0"/>
-                <w:numId w:val="1000"/>
-              </w:numPr>
-              <w:pStyle w:val="Compact"/>
-              <w:jc w:val="center"/>
-            </w:pPr>
-            <w:r>
-              <w:t xml:space="preserve">2634</w:t>
+              <w:pStyle w:val="Compact"/>
+              <w:jc w:val="center"/>
+            </w:pPr>
+            <w:r>
+              <w:t xml:space="preserve">10866</w:t>
+            </w:r>
+          </w:p>
+        </w:tc>
+        <w:tc>
+          <w:tcPr/>
+          <w:p>
+            <w:pPr>
+              <w:pStyle w:val="Compact"/>
+              <w:jc w:val="center"/>
+            </w:pPr>
+            <w:r>
+              <w:t xml:space="preserve">94</w:t>
+            </w:r>
+          </w:p>
+        </w:tc>
+        <w:tc>
+          <w:tcPr/>
+          <w:p>
+            <w:pPr>
+              <w:pStyle w:val="Compact"/>
+              <w:jc w:val="center"/>
+            </w:pPr>
+            <w:r>
+              <w:t xml:space="preserve">7766</w:t>
+            </w:r>
+          </w:p>
+        </w:tc>
+        <w:tc>
+          <w:tcPr/>
+          <w:p>
+            <w:pPr>
+              <w:pStyle w:val="Compact"/>
+              <w:jc w:val="center"/>
+            </w:pPr>
+            <w:r>
+              <w:t xml:space="preserve">45</w:t>
+            </w:r>
+          </w:p>
+        </w:tc>
+        <w:tc>
+          <w:tcPr/>
+          <w:p>
+            <w:pPr>
+              <w:pStyle w:val="Compact"/>
+              <w:jc w:val="center"/>
+            </w:pPr>
+            <w:r>
+              <w:t xml:space="preserve">7432</w:t>
+            </w:r>
+          </w:p>
+        </w:tc>
+        <w:tc>
+          <w:tcPr/>
+          <w:p>
+            <w:pPr>
+              <w:pStyle w:val="Compact"/>
+              <w:jc w:val="center"/>
+            </w:pPr>
+            <w:r>
+              <w:t xml:space="preserve">40</w:t>
+            </w:r>
+          </w:p>
+        </w:tc>
+        <w:tc>
+          <w:tcPr/>
+          <w:p>
+            <w:pPr>
+              <w:pStyle w:val="Compact"/>
+              <w:jc w:val="center"/>
+            </w:pPr>
+            <w:r>
+              <w:t xml:space="preserve">4880</w:t>
+            </w:r>
+          </w:p>
+        </w:tc>
+        <w:tc>
+          <w:tcPr/>
+          <w:p>
+            <w:pPr>
+              <w:pStyle w:val="Compact"/>
+              <w:jc w:val="center"/>
+            </w:pPr>
+            <w:r>
+              <w:t xml:space="preserve">3807</w:t>
             </w:r>
           </w:p>
         </w:tc>
@@ -723,10 +618,6 @@
           <w:tcPr/>
           <w:p>
             <w:pPr>
-              <w:numPr>
-                <w:ilvl w:val="0"/>
-                <w:numId w:val="1000"/>
-              </w:numPr>
               <w:pStyle w:val="Compact"/>
               <w:jc w:val="center"/>
             </w:pPr>
@@ -739,26 +630,18 @@
           <w:tcPr/>
           <w:p>
             <w:pPr>
-              <w:numPr>
-                <w:ilvl w:val="0"/>
-                <w:numId w:val="1000"/>
-              </w:numPr>
-              <w:pStyle w:val="Compact"/>
-              <w:jc w:val="center"/>
-            </w:pPr>
-            <w:r>
-              <w:t xml:space="preserve">15154</w:t>
-            </w:r>
-          </w:p>
-        </w:tc>
-        <w:tc>
-          <w:tcPr/>
-          <w:p>
-            <w:pPr>
-              <w:numPr>
-                <w:ilvl w:val="0"/>
-                <w:numId w:val="1000"/>
-              </w:numPr>
+              <w:pStyle w:val="Compact"/>
+              <w:jc w:val="center"/>
+            </w:pPr>
+            <w:r>
+              <w:t xml:space="preserve">16594</w:t>
+            </w:r>
+          </w:p>
+        </w:tc>
+        <w:tc>
+          <w:tcPr/>
+          <w:p>
+            <w:pPr>
               <w:pStyle w:val="Compact"/>
               <w:jc w:val="center"/>
             </w:pPr>
@@ -771,26 +654,18 @@
           <w:tcPr/>
           <w:p>
             <w:pPr>
-              <w:numPr>
-                <w:ilvl w:val="0"/>
-                <w:numId w:val="1000"/>
-              </w:numPr>
-              <w:pStyle w:val="Compact"/>
-              <w:jc w:val="center"/>
-            </w:pPr>
-            <w:r>
-              <w:t xml:space="preserve">15300</w:t>
-            </w:r>
-          </w:p>
-        </w:tc>
-        <w:tc>
-          <w:tcPr/>
-          <w:p>
-            <w:pPr>
-              <w:numPr>
-                <w:ilvl w:val="0"/>
-                <w:numId w:val="1000"/>
-              </w:numPr>
+              <w:pStyle w:val="Compact"/>
+              <w:jc w:val="center"/>
+            </w:pPr>
+            <w:r>
+              <w:t xml:space="preserve">15599</w:t>
+            </w:r>
+          </w:p>
+        </w:tc>
+        <w:tc>
+          <w:tcPr/>
+          <w:p>
+            <w:pPr>
               <w:pStyle w:val="Compact"/>
               <w:jc w:val="center"/>
             </w:pPr>
@@ -803,26 +678,18 @@
           <w:tcPr/>
           <w:p>
             <w:pPr>
-              <w:numPr>
-                <w:ilvl w:val="0"/>
-                <w:numId w:val="1000"/>
-              </w:numPr>
-              <w:pStyle w:val="Compact"/>
-              <w:jc w:val="center"/>
-            </w:pPr>
-            <w:r>
-              <w:t xml:space="preserve">15418</w:t>
-            </w:r>
-          </w:p>
-        </w:tc>
-        <w:tc>
-          <w:tcPr/>
-          <w:p>
-            <w:pPr>
-              <w:numPr>
-                <w:ilvl w:val="0"/>
-                <w:numId w:val="1000"/>
-              </w:numPr>
+              <w:pStyle w:val="Compact"/>
+              <w:jc w:val="center"/>
+            </w:pPr>
+            <w:r>
+              <w:t xml:space="preserve">15756</w:t>
+            </w:r>
+          </w:p>
+        </w:tc>
+        <w:tc>
+          <w:tcPr/>
+          <w:p>
+            <w:pPr>
               <w:pStyle w:val="Compact"/>
               <w:jc w:val="center"/>
             </w:pPr>
@@ -835,31 +702,23 @@
           <w:tcPr/>
           <w:p>
             <w:pPr>
-              <w:numPr>
-                <w:ilvl w:val="0"/>
-                <w:numId w:val="1000"/>
-              </w:numPr>
-              <w:pStyle w:val="Compact"/>
-              <w:jc w:val="center"/>
-            </w:pPr>
-            <w:r>
-              <w:t xml:space="preserve">762</w:t>
-            </w:r>
-          </w:p>
-        </w:tc>
-        <w:tc>
-          <w:tcPr/>
-          <w:p>
-            <w:pPr>
-              <w:numPr>
-                <w:ilvl w:val="0"/>
-                <w:numId w:val="1000"/>
-              </w:numPr>
-              <w:pStyle w:val="Compact"/>
-              <w:jc w:val="center"/>
-            </w:pPr>
-            <w:r>
-              <w:t xml:space="preserve">841</w:t>
+              <w:pStyle w:val="Compact"/>
+              <w:jc w:val="center"/>
+            </w:pPr>
+            <w:r>
+              <w:t xml:space="preserve">973</w:t>
+            </w:r>
+          </w:p>
+        </w:tc>
+        <w:tc>
+          <w:tcPr/>
+          <w:p>
+            <w:pPr>
+              <w:pStyle w:val="Compact"/>
+              <w:jc w:val="center"/>
+            </w:pPr>
+            <w:r>
+              <w:t xml:space="preserve">1100</w:t>
             </w:r>
           </w:p>
         </w:tc>
@@ -869,10 +728,6 @@
           <w:tcPr/>
           <w:p>
             <w:pPr>
-              <w:numPr>
-                <w:ilvl w:val="0"/>
-                <w:numId w:val="1000"/>
-              </w:numPr>
               <w:pStyle w:val="Compact"/>
               <w:jc w:val="center"/>
             </w:pPr>
@@ -885,26 +740,18 @@
           <w:tcPr/>
           <w:p>
             <w:pPr>
-              <w:numPr>
-                <w:ilvl w:val="0"/>
-                <w:numId w:val="1000"/>
-              </w:numPr>
-              <w:pStyle w:val="Compact"/>
-              <w:jc w:val="center"/>
-            </w:pPr>
-            <w:r>
-              <w:t xml:space="preserve">14664</w:t>
-            </w:r>
-          </w:p>
-        </w:tc>
-        <w:tc>
-          <w:tcPr/>
-          <w:p>
-            <w:pPr>
-              <w:numPr>
-                <w:ilvl w:val="0"/>
-                <w:numId w:val="1000"/>
-              </w:numPr>
+              <w:pStyle w:val="Compact"/>
+              <w:jc w:val="center"/>
+            </w:pPr>
+            <w:r>
+              <w:t xml:space="preserve">16058</w:t>
+            </w:r>
+          </w:p>
+        </w:tc>
+        <w:tc>
+          <w:tcPr/>
+          <w:p>
+            <w:pPr>
               <w:pStyle w:val="Compact"/>
               <w:jc w:val="center"/>
             </w:pPr>
@@ -917,26 +764,18 @@
           <w:tcPr/>
           <w:p>
             <w:pPr>
-              <w:numPr>
-                <w:ilvl w:val="0"/>
-                <w:numId w:val="1000"/>
-              </w:numPr>
-              <w:pStyle w:val="Compact"/>
-              <w:jc w:val="center"/>
-            </w:pPr>
-            <w:r>
-              <w:t xml:space="preserve">14174</w:t>
-            </w:r>
-          </w:p>
-        </w:tc>
-        <w:tc>
-          <w:tcPr/>
-          <w:p>
-            <w:pPr>
-              <w:numPr>
-                <w:ilvl w:val="0"/>
-                <w:numId w:val="1000"/>
-              </w:numPr>
+              <w:pStyle w:val="Compact"/>
+              <w:jc w:val="center"/>
+            </w:pPr>
+            <w:r>
+              <w:t xml:space="preserve">14450</w:t>
+            </w:r>
+          </w:p>
+        </w:tc>
+        <w:tc>
+          <w:tcPr/>
+          <w:p>
+            <w:pPr>
               <w:pStyle w:val="Compact"/>
               <w:jc w:val="center"/>
             </w:pPr>
@@ -949,26 +788,18 @@
           <w:tcPr/>
           <w:p>
             <w:pPr>
-              <w:numPr>
-                <w:ilvl w:val="0"/>
-                <w:numId w:val="1000"/>
-              </w:numPr>
-              <w:pStyle w:val="Compact"/>
-              <w:jc w:val="center"/>
-            </w:pPr>
-            <w:r>
-              <w:t xml:space="preserve">14097</w:t>
-            </w:r>
-          </w:p>
-        </w:tc>
-        <w:tc>
-          <w:tcPr/>
-          <w:p>
-            <w:pPr>
-              <w:numPr>
-                <w:ilvl w:val="0"/>
-                <w:numId w:val="1000"/>
-              </w:numPr>
+              <w:pStyle w:val="Compact"/>
+              <w:jc w:val="center"/>
+            </w:pPr>
+            <w:r>
+              <w:t xml:space="preserve">14537</w:t>
+            </w:r>
+          </w:p>
+        </w:tc>
+        <w:tc>
+          <w:tcPr/>
+          <w:p>
+            <w:pPr>
               <w:pStyle w:val="Compact"/>
               <w:jc w:val="center"/>
             </w:pPr>
@@ -981,31 +812,23 @@
           <w:tcPr/>
           <w:p>
             <w:pPr>
-              <w:numPr>
-                <w:ilvl w:val="0"/>
-                <w:numId w:val="1000"/>
-              </w:numPr>
-              <w:pStyle w:val="Compact"/>
-              <w:jc w:val="center"/>
-            </w:pPr>
-            <w:r>
-              <w:t xml:space="preserve">1004</w:t>
-            </w:r>
-          </w:p>
-        </w:tc>
-        <w:tc>
-          <w:tcPr/>
-          <w:p>
-            <w:pPr>
-              <w:numPr>
-                <w:ilvl w:val="0"/>
-                <w:numId w:val="1000"/>
-              </w:numPr>
-              <w:pStyle w:val="Compact"/>
-              <w:jc w:val="center"/>
-            </w:pPr>
-            <w:r>
-              <w:t xml:space="preserve">1080</w:t>
+              <w:pStyle w:val="Compact"/>
+              <w:jc w:val="center"/>
+            </w:pPr>
+            <w:r>
+              <w:t xml:space="preserve">1280</w:t>
+            </w:r>
+          </w:p>
+        </w:tc>
+        <w:tc>
+          <w:tcPr/>
+          <w:p>
+            <w:pPr>
+              <w:pStyle w:val="Compact"/>
+              <w:jc w:val="center"/>
+            </w:pPr>
+            <w:r>
+              <w:t xml:space="preserve">1405</w:t>
             </w:r>
           </w:p>
         </w:tc>
@@ -1015,10 +838,6 @@
           <w:tcPr/>
           <w:p>
             <w:pPr>
-              <w:numPr>
-                <w:ilvl w:val="0"/>
-                <w:numId w:val="1000"/>
-              </w:numPr>
               <w:pStyle w:val="Compact"/>
               <w:jc w:val="center"/>
             </w:pPr>
@@ -1031,26 +850,18 @@
           <w:tcPr/>
           <w:p>
             <w:pPr>
-              <w:numPr>
-                <w:ilvl w:val="0"/>
-                <w:numId w:val="1000"/>
-              </w:numPr>
-              <w:pStyle w:val="Compact"/>
-              <w:jc w:val="center"/>
-            </w:pPr>
-            <w:r>
-              <w:t xml:space="preserve">14198</w:t>
-            </w:r>
-          </w:p>
-        </w:tc>
-        <w:tc>
-          <w:tcPr/>
-          <w:p>
-            <w:pPr>
-              <w:numPr>
-                <w:ilvl w:val="0"/>
-                <w:numId w:val="1000"/>
-              </w:numPr>
+              <w:pStyle w:val="Compact"/>
+              <w:jc w:val="center"/>
+            </w:pPr>
+            <w:r>
+              <w:t xml:space="preserve">15551</w:t>
+            </w:r>
+          </w:p>
+        </w:tc>
+        <w:tc>
+          <w:tcPr/>
+          <w:p>
+            <w:pPr>
               <w:pStyle w:val="Compact"/>
               <w:jc w:val="center"/>
             </w:pPr>
@@ -1063,58 +874,42 @@
           <w:tcPr/>
           <w:p>
             <w:pPr>
-              <w:numPr>
-                <w:ilvl w:val="0"/>
-                <w:numId w:val="1000"/>
-              </w:numPr>
-              <w:pStyle w:val="Compact"/>
-              <w:jc w:val="center"/>
-            </w:pPr>
-            <w:r>
-              <w:t xml:space="preserve">13200</w:t>
-            </w:r>
-          </w:p>
-        </w:tc>
-        <w:tc>
-          <w:tcPr/>
-          <w:p>
-            <w:pPr>
-              <w:numPr>
-                <w:ilvl w:val="0"/>
-                <w:numId w:val="1000"/>
-              </w:numPr>
-              <w:pStyle w:val="Compact"/>
-              <w:jc w:val="center"/>
-            </w:pPr>
-            <w:r>
-              <w:t xml:space="preserve">95</w:t>
-            </w:r>
-          </w:p>
-        </w:tc>
-        <w:tc>
-          <w:tcPr/>
-          <w:p>
-            <w:pPr>
-              <w:numPr>
-                <w:ilvl w:val="0"/>
-                <w:numId w:val="1000"/>
-              </w:numPr>
-              <w:pStyle w:val="Compact"/>
-              <w:jc w:val="center"/>
-            </w:pPr>
-            <w:r>
-              <w:t xml:space="preserve">12991</w:t>
-            </w:r>
-          </w:p>
-        </w:tc>
-        <w:tc>
-          <w:tcPr/>
-          <w:p>
-            <w:pPr>
-              <w:numPr>
-                <w:ilvl w:val="0"/>
-                <w:numId w:val="1000"/>
-              </w:numPr>
+              <w:pStyle w:val="Compact"/>
+              <w:jc w:val="center"/>
+            </w:pPr>
+            <w:r>
+              <w:t xml:space="preserve">13491</w:t>
+            </w:r>
+          </w:p>
+        </w:tc>
+        <w:tc>
+          <w:tcPr/>
+          <w:p>
+            <w:pPr>
+              <w:pStyle w:val="Compact"/>
+              <w:jc w:val="center"/>
+            </w:pPr>
+            <w:r>
+              <w:t xml:space="preserve">94</w:t>
+            </w:r>
+          </w:p>
+        </w:tc>
+        <w:tc>
+          <w:tcPr/>
+          <w:p>
+            <w:pPr>
+              <w:pStyle w:val="Compact"/>
+              <w:jc w:val="center"/>
+            </w:pPr>
+            <w:r>
+              <w:t xml:space="preserve">13539</w:t>
+            </w:r>
+          </w:p>
+        </w:tc>
+        <w:tc>
+          <w:tcPr/>
+          <w:p>
+            <w:pPr>
               <w:pStyle w:val="Compact"/>
               <w:jc w:val="center"/>
             </w:pPr>
@@ -1127,31 +922,23 @@
           <w:tcPr/>
           <w:p>
             <w:pPr>
-              <w:numPr>
-                <w:ilvl w:val="0"/>
-                <w:numId w:val="1000"/>
-              </w:numPr>
-              <w:pStyle w:val="Compact"/>
-              <w:jc w:val="center"/>
-            </w:pPr>
-            <w:r>
-              <w:t xml:space="preserve">1240</w:t>
-            </w:r>
-          </w:p>
-        </w:tc>
-        <w:tc>
-          <w:tcPr/>
-          <w:p>
-            <w:pPr>
-              <w:numPr>
-                <w:ilvl w:val="0"/>
-                <w:numId w:val="1000"/>
-              </w:numPr>
-              <w:pStyle w:val="Compact"/>
-              <w:jc w:val="center"/>
-            </w:pPr>
-            <w:r>
-              <w:t xml:space="preserve">1301</w:t>
+              <w:pStyle w:val="Compact"/>
+              <w:jc w:val="center"/>
+            </w:pPr>
+            <w:r>
+              <w:t xml:space="preserve">1579</w:t>
+            </w:r>
+          </w:p>
+        </w:tc>
+        <w:tc>
+          <w:tcPr/>
+          <w:p>
+            <w:pPr>
+              <w:pStyle w:val="Compact"/>
+              <w:jc w:val="center"/>
+            </w:pPr>
+            <w:r>
+              <w:t xml:space="preserve">1684</w:t>
             </w:r>
           </w:p>
         </w:tc>
@@ -1449,6 +1236,25 @@
       <w:jc w:val="center"/>
     </w:pPr>
   </w:style>
+  <w:style w:customStyle="1" w:styleId="AbstractTitle" w:type="paragraph">
+    <w:name w:val="Abstract Title"/>
+    <w:basedOn w:val="Normal"/>
+    <w:next w:val="Abstract"/>
+    <w:qFormat/>
+    <w:pPr>
+      <w:keepNext/>
+      <w:keepLines/>
+      <w:jc w:val="center"/>
+      <w:spacing w:after="0" w:before="300"/>
+    </w:pPr>
+    <w:rPr>
+      <w:sz w:val="20"/>
+      <w:szCs w:val="20"/>
+      <w:b/>
+      <w:color w:val="345A8A"/>
+      &gt;
+    </w:rPr>
+  </w:style>
   <w:style w:customStyle="1" w:styleId="Abstract" w:type="paragraph">
     <w:name w:val="Abstract"/>
     <w:basedOn w:val="Normal"/>
@@ -1457,7 +1263,7 @@
     <w:pPr>
       <w:keepNext/>
       <w:keepLines/>
-      <w:spacing w:after="300" w:before="300"/>
+      <w:spacing w:after="300" w:before="100"/>
     </w:pPr>
     <w:rPr>
       <w:sz w:val="20"/>
@@ -1869,7 +1675,7 @@
     <w:name w:val="ConstantTok"/>
     <w:basedOn w:val="VerbatimChar"/>
     <w:rPr>
-      <w:color w:val="000000"/>
+      <w:color w:val="8f5902"/>
       <w:shd w:val="clear" w:fill="f8f8f8"/>
     </w:rPr>
   </w:style>
@@ -1885,8 +1691,9 @@
     <w:name w:val="SpecialCharTok"/>
     <w:basedOn w:val="VerbatimChar"/>
     <w:rPr>
-      <w:color w:val="000000"/>
-      <w:shd w:val="clear" w:fill="f8f8f8"/>
+      <w:color w:val="ce5c00"/>
+      <w:shd w:val="clear" w:fill="f8f8f8"/>
+      <w:b/>
     </w:rPr>
   </w:style>
   <w:style w:type="character" w:customStyle="1" w:styleId="StringTok">
@@ -1971,8 +1778,9 @@
     <w:name w:val="FunctionTok"/>
     <w:basedOn w:val="VerbatimChar"/>
     <w:rPr>
-      <w:color w:val="000000"/>
-      <w:shd w:val="clear" w:fill="f8f8f8"/>
+      <w:color w:val="204a87"/>
+      <w:shd w:val="clear" w:fill="f8f8f8"/>
+      <w:b/>
     </w:rPr>
   </w:style>
   <w:style w:type="character" w:customStyle="1" w:styleId="VariableTok">
@@ -2028,7 +1836,7 @@
     <w:name w:val="AttributeTok"/>
     <w:basedOn w:val="VerbatimChar"/>
     <w:rPr>
-      <w:color w:val="c4a000"/>
+      <w:color w:val="204a87"/>
       <w:shd w:val="clear" w:fill="f8f8f8"/>
     </w:rPr>
   </w:style>

</xml_diff>